<commit_message>
TS 2.1 Jatai Ghanam Corrections
</commit_message>
<xml_diff>
--- a/TS Jatai Ghanam Project/TS 2.1/TS 2.1 Ghanam Tamil Corrections.docx
+++ b/TS Jatai Ghanam Project/TS 2.1/TS 2.1 Ghanam Tamil Corrections.docx
@@ -1,6 +1,6 @@
 
 <file path=word/document.xml><?xml version="1.0" encoding="utf-8"?>
-<w:document xmlns:wpc="http://schemas.microsoft.com/office/word/2010/wordprocessingCanvas" xmlns:cx="http://schemas.microsoft.com/office/drawing/2014/chartex" xmlns:cx1="http://schemas.microsoft.com/office/drawing/2015/9/8/chartex" xmlns:cx2="http://schemas.microsoft.com/office/drawing/2015/10/21/chartex" xmlns:cx3="http://schemas.microsoft.com/office/drawing/2016/5/9/chartex" xmlns:cx4="http://schemas.microsoft.com/office/drawing/2016/5/10/chartex" xmlns:cx5="http://schemas.microsoft.com/office/drawing/2016/5/11/chartex" xmlns:cx6="http://schemas.microsoft.com/office/drawing/2016/5/12/chartex" xmlns:cx7="http://schemas.microsoft.com/office/drawing/2016/5/13/chartex" xmlns:cx8="http://schemas.microsoft.com/office/drawing/2016/5/14/chartex" xmlns:mc="http://schemas.openxmlformats.org/markup-compatibility/2006" xmlns:aink="http://schemas.microsoft.com/office/drawing/2016/ink" xmlns:am3d="http://schemas.microsoft.com/office/drawing/2017/model3d" xmlns:o="urn:schemas-microsoft-com:office:office" xmlns:oel="http://schemas.microsoft.com/office/2019/extlst" xmlns:r="http://schemas.openxmlformats.org/officeDocument/2006/relationships" xmlns:m="http://schemas.openxmlformats.org/officeDocument/2006/math" xmlns:v="urn:schemas-microsoft-com:vml" xmlns:wp14="http://schemas.microsoft.com/office/word/2010/wordprocessingDrawing" xmlns:wp="http://schemas.openxmlformats.org/drawingml/2006/wordprocessingDrawing" xmlns:w10="urn:schemas-microsoft-com:office:word" xmlns:w="http://schemas.openxmlformats.org/wordprocessingml/2006/main" xmlns:w14="http://schemas.microsoft.com/office/word/2010/wordml" xmlns:w15="http://schemas.microsoft.com/office/word/2012/wordml" xmlns:w16cex="http://schemas.microsoft.com/office/word/2018/wordml/cex" xmlns:w16cid="http://schemas.microsoft.com/office/word/2016/wordml/cid" xmlns:w16="http://schemas.microsoft.com/office/word/2018/wordml" xmlns:w16du="http://schemas.microsoft.com/office/word/2023/wordml/word16du" xmlns:w16sdtdh="http://schemas.microsoft.com/office/word/2020/wordml/sdtdatahash" xmlns:w16sdtfl="http://schemas.microsoft.com/office/word/2024/wordml/sdtformatlock" xmlns:w16se="http://schemas.microsoft.com/office/word/2015/wordml/symex" xmlns:wpg="http://schemas.microsoft.com/office/word/2010/wordprocessingGroup" xmlns:wpi="http://schemas.microsoft.com/office/word/2010/wordprocessingInk" xmlns:wne="http://schemas.microsoft.com/office/word/2006/wordml" xmlns:wps="http://schemas.microsoft.com/office/word/2010/wordprocessingShape" mc:Ignorable="w14 w15 w16se w16cid w16 w16cex w16sdtdh w16sdtfl w16du wp14">
+<w:document xmlns:wpc="http://schemas.microsoft.com/office/word/2010/wordprocessingCanvas" xmlns:cx="http://schemas.microsoft.com/office/drawing/2014/chartex" xmlns:cx1="http://schemas.microsoft.com/office/drawing/2015/9/8/chartex" xmlns:cx2="http://schemas.microsoft.com/office/drawing/2015/10/21/chartex" xmlns:cx3="http://schemas.microsoft.com/office/drawing/2016/5/9/chartex" xmlns:cx4="http://schemas.microsoft.com/office/drawing/2016/5/10/chartex" xmlns:cx5="http://schemas.microsoft.com/office/drawing/2016/5/11/chartex" xmlns:cx6="http://schemas.microsoft.com/office/drawing/2016/5/12/chartex" xmlns:cx7="http://schemas.microsoft.com/office/drawing/2016/5/13/chartex" xmlns:cx8="http://schemas.microsoft.com/office/drawing/2016/5/14/chartex" xmlns:mc="http://schemas.openxmlformats.org/markup-compatibility/2006" xmlns:aink="http://schemas.microsoft.com/office/drawing/2016/ink" xmlns:am3d="http://schemas.microsoft.com/office/drawing/2017/model3d" xmlns:o="urn:schemas-microsoft-com:office:office" xmlns:oel="http://schemas.microsoft.com/office/2019/extlst" xmlns:r="http://schemas.openxmlformats.org/officeDocument/2006/relationships" xmlns:m="http://schemas.openxmlformats.org/officeDocument/2006/math" xmlns:v="urn:schemas-microsoft-com:vml" xmlns:wp14="http://schemas.microsoft.com/office/word/2010/wordprocessingDrawing" xmlns:wp="http://schemas.openxmlformats.org/drawingml/2006/wordprocessingDrawing" xmlns:w10="urn:schemas-microsoft-com:office:word" xmlns:w="http://schemas.openxmlformats.org/wordprocessingml/2006/main" xmlns:w14="http://schemas.microsoft.com/office/word/2010/wordml" xmlns:w15="http://schemas.microsoft.com/office/word/2012/wordml" xmlns:w16cei="http://schemas.microsoft.com/office/word/2026/wordml/cei" xmlns:w16cex="http://schemas.microsoft.com/office/word/2018/wordml/cex" xmlns:w16cid="http://schemas.microsoft.com/office/word/2016/wordml/cid" xmlns:w16="http://schemas.microsoft.com/office/word/2018/wordml" xmlns:w16du="http://schemas.microsoft.com/office/word/2023/wordml/word16du" xmlns:w16sdtdh="http://schemas.microsoft.com/office/word/2020/wordml/sdtdatahash" xmlns:w16sdtfl="http://schemas.microsoft.com/office/word/2024/wordml/sdtformatlock" xmlns:w16se="http://schemas.microsoft.com/office/word/2015/wordml/symex" xmlns:wpg="http://schemas.microsoft.com/office/word/2010/wordprocessingGroup" xmlns:wpi="http://schemas.microsoft.com/office/word/2010/wordprocessingInk" xmlns:wne="http://schemas.microsoft.com/office/word/2006/wordml" xmlns:wps="http://schemas.microsoft.com/office/word/2010/wordprocessingShape" mc:Ignorable="w14 w15 w16se w16cid w16 w16cex w16sdtdh w16sdtfl w16du wp14">
   <w:body>
     <w:p>
       <w:pPr>
@@ -54,7 +54,6 @@
         </w:rPr>
         <w:t xml:space="preserve">– TS 2.1 </w:t>
       </w:r>
-      <w:proofErr w:type="gramStart"/>
       <w:r>
         <w:rPr>
           <w:b/>
@@ -63,7 +62,7 @@
           <w:szCs w:val="32"/>
           <w:u w:val="single"/>
         </w:rPr>
-        <w:t>Tamil</w:t>
+        <w:t xml:space="preserve">Tamil </w:t>
       </w:r>
       <w:r>
         <w:rPr>
@@ -73,30 +72,8 @@
           <w:szCs w:val="32"/>
           <w:u w:val="single"/>
         </w:rPr>
-        <w:t xml:space="preserve"> </w:t>
+        <w:t xml:space="preserve"> Corrections – Observed till 31st </w:t>
       </w:r>
-      <w:r>
-        <w:rPr>
-          <w:b/>
-          <w:bCs/>
-          <w:sz w:val="32"/>
-          <w:szCs w:val="32"/>
-          <w:u w:val="single"/>
-        </w:rPr>
-        <w:t xml:space="preserve"> Corrections</w:t>
-      </w:r>
-      <w:proofErr w:type="gramEnd"/>
-      <w:r>
-        <w:rPr>
-          <w:b/>
-          <w:bCs/>
-          <w:sz w:val="32"/>
-          <w:szCs w:val="32"/>
-          <w:u w:val="single"/>
-        </w:rPr>
-        <w:t xml:space="preserve"> – Observed till 31st </w:t>
-      </w:r>
-      <w:proofErr w:type="gramStart"/>
       <w:r>
         <w:rPr>
           <w:b/>
@@ -107,7 +84,6 @@
         </w:rPr>
         <w:t>July  2026</w:t>
       </w:r>
-      <w:proofErr w:type="gramEnd"/>
     </w:p>
     <w:p>
       <w:pPr>
@@ -236,7 +212,7 @@
                 <w:bCs/>
                 <w:szCs w:val="40"/>
               </w:rPr>
-              <w:t>NIL   NIL   Nil</w:t>
+              <w:t xml:space="preserve">NIL   </w:t>
             </w:r>
           </w:p>
         </w:tc>
@@ -263,7 +239,7 @@
                 <w:bCs/>
                 <w:szCs w:val="40"/>
               </w:rPr>
-              <w:t>NIL   NIL   Nil</w:t>
+              <w:t xml:space="preserve">NIL  </w:t>
             </w:r>
           </w:p>
         </w:tc>
@@ -27585,7 +27561,6 @@
               </w:rPr>
               <w:t>4)</w:t>
             </w:r>
-            <w:proofErr w:type="gramStart"/>
             <w:r>
               <w:rPr>
                 <w:rFonts w:ascii="Latha" w:hAnsi="Latha" w:cs="Latha"/>
@@ -27603,7 +27578,6 @@
               </w:rPr>
               <w:t>அ</w:t>
             </w:r>
-            <w:proofErr w:type="gramEnd"/>
             <w:r>
               <w:rPr>
                 <w:rFonts w:ascii="BRH Tamil Tab Extra" w:hAnsi="BRH Tamil Tab Extra" w:cs="Latha"/>
@@ -27992,7 +27966,6 @@
               </w:rPr>
               <w:t>4)</w:t>
             </w:r>
-            <w:proofErr w:type="gramStart"/>
             <w:r>
               <w:rPr>
                 <w:rFonts w:ascii="Latha" w:hAnsi="Latha" w:cs="Latha"/>
@@ -28010,7 +27983,6 @@
               </w:rPr>
               <w:t>அ</w:t>
             </w:r>
-            <w:proofErr w:type="gramEnd"/>
             <w:r>
               <w:rPr>
                 <w:rFonts w:ascii="BRH Tamil Tab Extra" w:hAnsi="BRH Tamil Tab Extra" w:cs="Latha"/>
@@ -55938,7 +55910,7 @@
 </file>
 
 <file path=word/endnotes.xml><?xml version="1.0" encoding="utf-8"?>
-<w:endnotes xmlns:wpc="http://schemas.microsoft.com/office/word/2010/wordprocessingCanvas" xmlns:cx="http://schemas.microsoft.com/office/drawing/2014/chartex" xmlns:cx1="http://schemas.microsoft.com/office/drawing/2015/9/8/chartex" xmlns:cx2="http://schemas.microsoft.com/office/drawing/2015/10/21/chartex" xmlns:cx3="http://schemas.microsoft.com/office/drawing/2016/5/9/chartex" xmlns:cx4="http://schemas.microsoft.com/office/drawing/2016/5/10/chartex" xmlns:cx5="http://schemas.microsoft.com/office/drawing/2016/5/11/chartex" xmlns:cx6="http://schemas.microsoft.com/office/drawing/2016/5/12/chartex" xmlns:cx7="http://schemas.microsoft.com/office/drawing/2016/5/13/chartex" xmlns:cx8="http://schemas.microsoft.com/office/drawing/2016/5/14/chartex" xmlns:mc="http://schemas.openxmlformats.org/markup-compatibility/2006" xmlns:aink="http://schemas.microsoft.com/office/drawing/2016/ink" xmlns:am3d="http://schemas.microsoft.com/office/drawing/2017/model3d" xmlns:o="urn:schemas-microsoft-com:office:office" xmlns:oel="http://schemas.microsoft.com/office/2019/extlst" xmlns:r="http://schemas.openxmlformats.org/officeDocument/2006/relationships" xmlns:m="http://schemas.openxmlformats.org/officeDocument/2006/math" xmlns:v="urn:schemas-microsoft-com:vml" xmlns:wp14="http://schemas.microsoft.com/office/word/2010/wordprocessingDrawing" xmlns:wp="http://schemas.openxmlformats.org/drawingml/2006/wordprocessingDrawing" xmlns:w10="urn:schemas-microsoft-com:office:word" xmlns:w="http://schemas.openxmlformats.org/wordprocessingml/2006/main" xmlns:w14="http://schemas.microsoft.com/office/word/2010/wordml" xmlns:w15="http://schemas.microsoft.com/office/word/2012/wordml" xmlns:w16cex="http://schemas.microsoft.com/office/word/2018/wordml/cex" xmlns:w16cid="http://schemas.microsoft.com/office/word/2016/wordml/cid" xmlns:w16="http://schemas.microsoft.com/office/word/2018/wordml" xmlns:w16du="http://schemas.microsoft.com/office/word/2023/wordml/word16du" xmlns:w16sdtdh="http://schemas.microsoft.com/office/word/2020/wordml/sdtdatahash" xmlns:w16sdtfl="http://schemas.microsoft.com/office/word/2024/wordml/sdtformatlock" xmlns:w16se="http://schemas.microsoft.com/office/word/2015/wordml/symex" xmlns:wpg="http://schemas.microsoft.com/office/word/2010/wordprocessingGroup" xmlns:wpi="http://schemas.microsoft.com/office/word/2010/wordprocessingInk" xmlns:wne="http://schemas.microsoft.com/office/word/2006/wordml" xmlns:wps="http://schemas.microsoft.com/office/word/2010/wordprocessingShape" mc:Ignorable="w14 w15 w16se w16cid w16 w16cex w16sdtdh w16sdtfl w16du wp14">
+<w:endnotes xmlns:wpc="http://schemas.microsoft.com/office/word/2010/wordprocessingCanvas" xmlns:cx="http://schemas.microsoft.com/office/drawing/2014/chartex" xmlns:cx1="http://schemas.microsoft.com/office/drawing/2015/9/8/chartex" xmlns:cx2="http://schemas.microsoft.com/office/drawing/2015/10/21/chartex" xmlns:cx3="http://schemas.microsoft.com/office/drawing/2016/5/9/chartex" xmlns:cx4="http://schemas.microsoft.com/office/drawing/2016/5/10/chartex" xmlns:cx5="http://schemas.microsoft.com/office/drawing/2016/5/11/chartex" xmlns:cx6="http://schemas.microsoft.com/office/drawing/2016/5/12/chartex" xmlns:cx7="http://schemas.microsoft.com/office/drawing/2016/5/13/chartex" xmlns:cx8="http://schemas.microsoft.com/office/drawing/2016/5/14/chartex" xmlns:mc="http://schemas.openxmlformats.org/markup-compatibility/2006" xmlns:aink="http://schemas.microsoft.com/office/drawing/2016/ink" xmlns:am3d="http://schemas.microsoft.com/office/drawing/2017/model3d" xmlns:o="urn:schemas-microsoft-com:office:office" xmlns:oel="http://schemas.microsoft.com/office/2019/extlst" xmlns:r="http://schemas.openxmlformats.org/officeDocument/2006/relationships" xmlns:m="http://schemas.openxmlformats.org/officeDocument/2006/math" xmlns:v="urn:schemas-microsoft-com:vml" xmlns:wp14="http://schemas.microsoft.com/office/word/2010/wordprocessingDrawing" xmlns:wp="http://schemas.openxmlformats.org/drawingml/2006/wordprocessingDrawing" xmlns:w10="urn:schemas-microsoft-com:office:word" xmlns:w="http://schemas.openxmlformats.org/wordprocessingml/2006/main" xmlns:w14="http://schemas.microsoft.com/office/word/2010/wordml" xmlns:w15="http://schemas.microsoft.com/office/word/2012/wordml" xmlns:w16cei="http://schemas.microsoft.com/office/word/2026/wordml/cei" xmlns:w16cex="http://schemas.microsoft.com/office/word/2018/wordml/cex" xmlns:w16cid="http://schemas.microsoft.com/office/word/2016/wordml/cid" xmlns:w16="http://schemas.microsoft.com/office/word/2018/wordml" xmlns:w16du="http://schemas.microsoft.com/office/word/2023/wordml/word16du" xmlns:w16sdtdh="http://schemas.microsoft.com/office/word/2020/wordml/sdtdatahash" xmlns:w16sdtfl="http://schemas.microsoft.com/office/word/2024/wordml/sdtformatlock" xmlns:w16se="http://schemas.microsoft.com/office/word/2015/wordml/symex" xmlns:wpg="http://schemas.microsoft.com/office/word/2010/wordprocessingGroup" xmlns:wpi="http://schemas.microsoft.com/office/word/2010/wordprocessingInk" xmlns:wne="http://schemas.microsoft.com/office/word/2006/wordml" xmlns:wps="http://schemas.microsoft.com/office/word/2010/wordprocessingShape" mc:Ignorable="w14 w15 w16se w16cid w16 w16cex w16sdtdh w16sdtfl w16du wp14">
   <w:endnote w:type="separator" w:id="-1">
     <w:p>
       <w:pPr>
@@ -55963,7 +55935,7 @@
 </file>
 
 <file path=word/footer1.xml><?xml version="1.0" encoding="utf-8"?>
-<w:ftr xmlns:wpc="http://schemas.microsoft.com/office/word/2010/wordprocessingCanvas" xmlns:cx="http://schemas.microsoft.com/office/drawing/2014/chartex" xmlns:cx1="http://schemas.microsoft.com/office/drawing/2015/9/8/chartex" xmlns:cx2="http://schemas.microsoft.com/office/drawing/2015/10/21/chartex" xmlns:cx3="http://schemas.microsoft.com/office/drawing/2016/5/9/chartex" xmlns:cx4="http://schemas.microsoft.com/office/drawing/2016/5/10/chartex" xmlns:cx5="http://schemas.microsoft.com/office/drawing/2016/5/11/chartex" xmlns:cx6="http://schemas.microsoft.com/office/drawing/2016/5/12/chartex" xmlns:cx7="http://schemas.microsoft.com/office/drawing/2016/5/13/chartex" xmlns:cx8="http://schemas.microsoft.com/office/drawing/2016/5/14/chartex" xmlns:mc="http://schemas.openxmlformats.org/markup-compatibility/2006" xmlns:aink="http://schemas.microsoft.com/office/drawing/2016/ink" xmlns:am3d="http://schemas.microsoft.com/office/drawing/2017/model3d" xmlns:o="urn:schemas-microsoft-com:office:office" xmlns:oel="http://schemas.microsoft.com/office/2019/extlst" xmlns:r="http://schemas.openxmlformats.org/officeDocument/2006/relationships" xmlns:m="http://schemas.openxmlformats.org/officeDocument/2006/math" xmlns:v="urn:schemas-microsoft-com:vml" xmlns:wp14="http://schemas.microsoft.com/office/word/2010/wordprocessingDrawing" xmlns:wp="http://schemas.openxmlformats.org/drawingml/2006/wordprocessingDrawing" xmlns:w10="urn:schemas-microsoft-com:office:word" xmlns:w="http://schemas.openxmlformats.org/wordprocessingml/2006/main" xmlns:w14="http://schemas.microsoft.com/office/word/2010/wordml" xmlns:w15="http://schemas.microsoft.com/office/word/2012/wordml" xmlns:w16cex="http://schemas.microsoft.com/office/word/2018/wordml/cex" xmlns:w16cid="http://schemas.microsoft.com/office/word/2016/wordml/cid" xmlns:w16="http://schemas.microsoft.com/office/word/2018/wordml" xmlns:w16du="http://schemas.microsoft.com/office/word/2023/wordml/word16du" xmlns:w16sdtdh="http://schemas.microsoft.com/office/word/2020/wordml/sdtdatahash" xmlns:w16sdtfl="http://schemas.microsoft.com/office/word/2024/wordml/sdtformatlock" xmlns:w16se="http://schemas.microsoft.com/office/word/2015/wordml/symex" xmlns:wpg="http://schemas.microsoft.com/office/word/2010/wordprocessingGroup" xmlns:wpi="http://schemas.microsoft.com/office/word/2010/wordprocessingInk" xmlns:wne="http://schemas.microsoft.com/office/word/2006/wordml" xmlns:wps="http://schemas.microsoft.com/office/word/2010/wordprocessingShape" mc:Ignorable="w14 w15 w16se w16cid w16 w16cex w16sdtdh w16sdtfl w16du wp14">
+<w:ftr xmlns:wpc="http://schemas.microsoft.com/office/word/2010/wordprocessingCanvas" xmlns:cx="http://schemas.microsoft.com/office/drawing/2014/chartex" xmlns:cx1="http://schemas.microsoft.com/office/drawing/2015/9/8/chartex" xmlns:cx2="http://schemas.microsoft.com/office/drawing/2015/10/21/chartex" xmlns:cx3="http://schemas.microsoft.com/office/drawing/2016/5/9/chartex" xmlns:cx4="http://schemas.microsoft.com/office/drawing/2016/5/10/chartex" xmlns:cx5="http://schemas.microsoft.com/office/drawing/2016/5/11/chartex" xmlns:cx6="http://schemas.microsoft.com/office/drawing/2016/5/12/chartex" xmlns:cx7="http://schemas.microsoft.com/office/drawing/2016/5/13/chartex" xmlns:cx8="http://schemas.microsoft.com/office/drawing/2016/5/14/chartex" xmlns:mc="http://schemas.openxmlformats.org/markup-compatibility/2006" xmlns:aink="http://schemas.microsoft.com/office/drawing/2016/ink" xmlns:am3d="http://schemas.microsoft.com/office/drawing/2017/model3d" xmlns:o="urn:schemas-microsoft-com:office:office" xmlns:oel="http://schemas.microsoft.com/office/2019/extlst" xmlns:r="http://schemas.openxmlformats.org/officeDocument/2006/relationships" xmlns:m="http://schemas.openxmlformats.org/officeDocument/2006/math" xmlns:v="urn:schemas-microsoft-com:vml" xmlns:wp14="http://schemas.microsoft.com/office/word/2010/wordprocessingDrawing" xmlns:wp="http://schemas.openxmlformats.org/drawingml/2006/wordprocessingDrawing" xmlns:w10="urn:schemas-microsoft-com:office:word" xmlns:w="http://schemas.openxmlformats.org/wordprocessingml/2006/main" xmlns:w14="http://schemas.microsoft.com/office/word/2010/wordml" xmlns:w15="http://schemas.microsoft.com/office/word/2012/wordml" xmlns:w16cei="http://schemas.microsoft.com/office/word/2026/wordml/cei" xmlns:w16cex="http://schemas.microsoft.com/office/word/2018/wordml/cex" xmlns:w16cid="http://schemas.microsoft.com/office/word/2016/wordml/cid" xmlns:w16="http://schemas.microsoft.com/office/word/2018/wordml" xmlns:w16du="http://schemas.microsoft.com/office/word/2023/wordml/word16du" xmlns:w16sdtdh="http://schemas.microsoft.com/office/word/2020/wordml/sdtdatahash" xmlns:w16sdtfl="http://schemas.microsoft.com/office/word/2024/wordml/sdtformatlock" xmlns:w16se="http://schemas.microsoft.com/office/word/2015/wordml/symex" xmlns:wpg="http://schemas.microsoft.com/office/word/2010/wordprocessingGroup" xmlns:wpi="http://schemas.microsoft.com/office/word/2010/wordprocessingInk" xmlns:wne="http://schemas.microsoft.com/office/word/2006/wordml" xmlns:wps="http://schemas.microsoft.com/office/word/2010/wordprocessingShape" mc:Ignorable="w14 w15 w16se w16cid w16 w16cex w16sdtdh w16sdtfl w16du wp14">
   <w:p>
     <w:pPr>
       <w:pBdr>
@@ -56148,7 +56120,7 @@
 </file>
 
 <file path=word/footer2.xml><?xml version="1.0" encoding="utf-8"?>
-<w:ftr xmlns:wpc="http://schemas.microsoft.com/office/word/2010/wordprocessingCanvas" xmlns:cx="http://schemas.microsoft.com/office/drawing/2014/chartex" xmlns:cx1="http://schemas.microsoft.com/office/drawing/2015/9/8/chartex" xmlns:cx2="http://schemas.microsoft.com/office/drawing/2015/10/21/chartex" xmlns:cx3="http://schemas.microsoft.com/office/drawing/2016/5/9/chartex" xmlns:cx4="http://schemas.microsoft.com/office/drawing/2016/5/10/chartex" xmlns:cx5="http://schemas.microsoft.com/office/drawing/2016/5/11/chartex" xmlns:cx6="http://schemas.microsoft.com/office/drawing/2016/5/12/chartex" xmlns:cx7="http://schemas.microsoft.com/office/drawing/2016/5/13/chartex" xmlns:cx8="http://schemas.microsoft.com/office/drawing/2016/5/14/chartex" xmlns:mc="http://schemas.openxmlformats.org/markup-compatibility/2006" xmlns:aink="http://schemas.microsoft.com/office/drawing/2016/ink" xmlns:am3d="http://schemas.microsoft.com/office/drawing/2017/model3d" xmlns:o="urn:schemas-microsoft-com:office:office" xmlns:oel="http://schemas.microsoft.com/office/2019/extlst" xmlns:r="http://schemas.openxmlformats.org/officeDocument/2006/relationships" xmlns:m="http://schemas.openxmlformats.org/officeDocument/2006/math" xmlns:v="urn:schemas-microsoft-com:vml" xmlns:wp14="http://schemas.microsoft.com/office/word/2010/wordprocessingDrawing" xmlns:wp="http://schemas.openxmlformats.org/drawingml/2006/wordprocessingDrawing" xmlns:w10="urn:schemas-microsoft-com:office:word" xmlns:w="http://schemas.openxmlformats.org/wordprocessingml/2006/main" xmlns:w14="http://schemas.microsoft.com/office/word/2010/wordml" xmlns:w15="http://schemas.microsoft.com/office/word/2012/wordml" xmlns:w16cex="http://schemas.microsoft.com/office/word/2018/wordml/cex" xmlns:w16cid="http://schemas.microsoft.com/office/word/2016/wordml/cid" xmlns:w16="http://schemas.microsoft.com/office/word/2018/wordml" xmlns:w16du="http://schemas.microsoft.com/office/word/2023/wordml/word16du" xmlns:w16sdtdh="http://schemas.microsoft.com/office/word/2020/wordml/sdtdatahash" xmlns:w16sdtfl="http://schemas.microsoft.com/office/word/2024/wordml/sdtformatlock" xmlns:w16se="http://schemas.microsoft.com/office/word/2015/wordml/symex" xmlns:wpg="http://schemas.microsoft.com/office/word/2010/wordprocessingGroup" xmlns:wpi="http://schemas.microsoft.com/office/word/2010/wordprocessingInk" xmlns:wne="http://schemas.microsoft.com/office/word/2006/wordml" xmlns:wps="http://schemas.microsoft.com/office/word/2010/wordprocessingShape" mc:Ignorable="w14 w15 w16se w16cid w16 w16cex w16sdtdh w16sdtfl w16du wp14">
+<w:ftr xmlns:wpc="http://schemas.microsoft.com/office/word/2010/wordprocessingCanvas" xmlns:cx="http://schemas.microsoft.com/office/drawing/2014/chartex" xmlns:cx1="http://schemas.microsoft.com/office/drawing/2015/9/8/chartex" xmlns:cx2="http://schemas.microsoft.com/office/drawing/2015/10/21/chartex" xmlns:cx3="http://schemas.microsoft.com/office/drawing/2016/5/9/chartex" xmlns:cx4="http://schemas.microsoft.com/office/drawing/2016/5/10/chartex" xmlns:cx5="http://schemas.microsoft.com/office/drawing/2016/5/11/chartex" xmlns:cx6="http://schemas.microsoft.com/office/drawing/2016/5/12/chartex" xmlns:cx7="http://schemas.microsoft.com/office/drawing/2016/5/13/chartex" xmlns:cx8="http://schemas.microsoft.com/office/drawing/2016/5/14/chartex" xmlns:mc="http://schemas.openxmlformats.org/markup-compatibility/2006" xmlns:aink="http://schemas.microsoft.com/office/drawing/2016/ink" xmlns:am3d="http://schemas.microsoft.com/office/drawing/2017/model3d" xmlns:o="urn:schemas-microsoft-com:office:office" xmlns:oel="http://schemas.microsoft.com/office/2019/extlst" xmlns:r="http://schemas.openxmlformats.org/officeDocument/2006/relationships" xmlns:m="http://schemas.openxmlformats.org/officeDocument/2006/math" xmlns:v="urn:schemas-microsoft-com:vml" xmlns:wp14="http://schemas.microsoft.com/office/word/2010/wordprocessingDrawing" xmlns:wp="http://schemas.openxmlformats.org/drawingml/2006/wordprocessingDrawing" xmlns:w10="urn:schemas-microsoft-com:office:word" xmlns:w="http://schemas.openxmlformats.org/wordprocessingml/2006/main" xmlns:w14="http://schemas.microsoft.com/office/word/2010/wordml" xmlns:w15="http://schemas.microsoft.com/office/word/2012/wordml" xmlns:w16cei="http://schemas.microsoft.com/office/word/2026/wordml/cei" xmlns:w16cex="http://schemas.microsoft.com/office/word/2018/wordml/cex" xmlns:w16cid="http://schemas.microsoft.com/office/word/2016/wordml/cid" xmlns:w16="http://schemas.microsoft.com/office/word/2018/wordml" xmlns:w16du="http://schemas.microsoft.com/office/word/2023/wordml/word16du" xmlns:w16sdtdh="http://schemas.microsoft.com/office/word/2020/wordml/sdtdatahash" xmlns:w16sdtfl="http://schemas.microsoft.com/office/word/2024/wordml/sdtformatlock" xmlns:w16se="http://schemas.microsoft.com/office/word/2015/wordml/symex" xmlns:wpg="http://schemas.microsoft.com/office/word/2010/wordprocessingGroup" xmlns:wpi="http://schemas.microsoft.com/office/word/2010/wordprocessingInk" xmlns:wne="http://schemas.microsoft.com/office/word/2006/wordml" xmlns:wps="http://schemas.microsoft.com/office/word/2010/wordprocessingShape" mc:Ignorable="w14 w15 w16se w16cid w16 w16cex w16sdtdh w16sdtfl w16du wp14">
   <w:p>
     <w:pPr>
       <w:pBdr>
@@ -56318,7 +56290,7 @@
 </file>
 
 <file path=word/footnotes.xml><?xml version="1.0" encoding="utf-8"?>
-<w:footnotes xmlns:wpc="http://schemas.microsoft.com/office/word/2010/wordprocessingCanvas" xmlns:cx="http://schemas.microsoft.com/office/drawing/2014/chartex" xmlns:cx1="http://schemas.microsoft.com/office/drawing/2015/9/8/chartex" xmlns:cx2="http://schemas.microsoft.com/office/drawing/2015/10/21/chartex" xmlns:cx3="http://schemas.microsoft.com/office/drawing/2016/5/9/chartex" xmlns:cx4="http://schemas.microsoft.com/office/drawing/2016/5/10/chartex" xmlns:cx5="http://schemas.microsoft.com/office/drawing/2016/5/11/chartex" xmlns:cx6="http://schemas.microsoft.com/office/drawing/2016/5/12/chartex" xmlns:cx7="http://schemas.microsoft.com/office/drawing/2016/5/13/chartex" xmlns:cx8="http://schemas.microsoft.com/office/drawing/2016/5/14/chartex" xmlns:mc="http://schemas.openxmlformats.org/markup-compatibility/2006" xmlns:aink="http://schemas.microsoft.com/office/drawing/2016/ink" xmlns:am3d="http://schemas.microsoft.com/office/drawing/2017/model3d" xmlns:o="urn:schemas-microsoft-com:office:office" xmlns:oel="http://schemas.microsoft.com/office/2019/extlst" xmlns:r="http://schemas.openxmlformats.org/officeDocument/2006/relationships" xmlns:m="http://schemas.openxmlformats.org/officeDocument/2006/math" xmlns:v="urn:schemas-microsoft-com:vml" xmlns:wp14="http://schemas.microsoft.com/office/word/2010/wordprocessingDrawing" xmlns:wp="http://schemas.openxmlformats.org/drawingml/2006/wordprocessingDrawing" xmlns:w10="urn:schemas-microsoft-com:office:word" xmlns:w="http://schemas.openxmlformats.org/wordprocessingml/2006/main" xmlns:w14="http://schemas.microsoft.com/office/word/2010/wordml" xmlns:w15="http://schemas.microsoft.com/office/word/2012/wordml" xmlns:w16cex="http://schemas.microsoft.com/office/word/2018/wordml/cex" xmlns:w16cid="http://schemas.microsoft.com/office/word/2016/wordml/cid" xmlns:w16="http://schemas.microsoft.com/office/word/2018/wordml" xmlns:w16du="http://schemas.microsoft.com/office/word/2023/wordml/word16du" xmlns:w16sdtdh="http://schemas.microsoft.com/office/word/2020/wordml/sdtdatahash" xmlns:w16sdtfl="http://schemas.microsoft.com/office/word/2024/wordml/sdtformatlock" xmlns:w16se="http://schemas.microsoft.com/office/word/2015/wordml/symex" xmlns:wpg="http://schemas.microsoft.com/office/word/2010/wordprocessingGroup" xmlns:wpi="http://schemas.microsoft.com/office/word/2010/wordprocessingInk" xmlns:wne="http://schemas.microsoft.com/office/word/2006/wordml" xmlns:wps="http://schemas.microsoft.com/office/word/2010/wordprocessingShape" mc:Ignorable="w14 w15 w16se w16cid w16 w16cex w16sdtdh w16sdtfl w16du wp14">
+<w:footnotes xmlns:wpc="http://schemas.microsoft.com/office/word/2010/wordprocessingCanvas" xmlns:cx="http://schemas.microsoft.com/office/drawing/2014/chartex" xmlns:cx1="http://schemas.microsoft.com/office/drawing/2015/9/8/chartex" xmlns:cx2="http://schemas.microsoft.com/office/drawing/2015/10/21/chartex" xmlns:cx3="http://schemas.microsoft.com/office/drawing/2016/5/9/chartex" xmlns:cx4="http://schemas.microsoft.com/office/drawing/2016/5/10/chartex" xmlns:cx5="http://schemas.microsoft.com/office/drawing/2016/5/11/chartex" xmlns:cx6="http://schemas.microsoft.com/office/drawing/2016/5/12/chartex" xmlns:cx7="http://schemas.microsoft.com/office/drawing/2016/5/13/chartex" xmlns:cx8="http://schemas.microsoft.com/office/drawing/2016/5/14/chartex" xmlns:mc="http://schemas.openxmlformats.org/markup-compatibility/2006" xmlns:aink="http://schemas.microsoft.com/office/drawing/2016/ink" xmlns:am3d="http://schemas.microsoft.com/office/drawing/2017/model3d" xmlns:o="urn:schemas-microsoft-com:office:office" xmlns:oel="http://schemas.microsoft.com/office/2019/extlst" xmlns:r="http://schemas.openxmlformats.org/officeDocument/2006/relationships" xmlns:m="http://schemas.openxmlformats.org/officeDocument/2006/math" xmlns:v="urn:schemas-microsoft-com:vml" xmlns:wp14="http://schemas.microsoft.com/office/word/2010/wordprocessingDrawing" xmlns:wp="http://schemas.openxmlformats.org/drawingml/2006/wordprocessingDrawing" xmlns:w10="urn:schemas-microsoft-com:office:word" xmlns:w="http://schemas.openxmlformats.org/wordprocessingml/2006/main" xmlns:w14="http://schemas.microsoft.com/office/word/2010/wordml" xmlns:w15="http://schemas.microsoft.com/office/word/2012/wordml" xmlns:w16cei="http://schemas.microsoft.com/office/word/2026/wordml/cei" xmlns:w16cex="http://schemas.microsoft.com/office/word/2018/wordml/cex" xmlns:w16cid="http://schemas.microsoft.com/office/word/2016/wordml/cid" xmlns:w16="http://schemas.microsoft.com/office/word/2018/wordml" xmlns:w16du="http://schemas.microsoft.com/office/word/2023/wordml/word16du" xmlns:w16sdtdh="http://schemas.microsoft.com/office/word/2020/wordml/sdtdatahash" xmlns:w16sdtfl="http://schemas.microsoft.com/office/word/2024/wordml/sdtformatlock" xmlns:w16se="http://schemas.microsoft.com/office/word/2015/wordml/symex" xmlns:wpg="http://schemas.microsoft.com/office/word/2010/wordprocessingGroup" xmlns:wpi="http://schemas.microsoft.com/office/word/2010/wordprocessingInk" xmlns:wne="http://schemas.microsoft.com/office/word/2006/wordml" xmlns:wps="http://schemas.microsoft.com/office/word/2010/wordprocessingShape" mc:Ignorable="w14 w15 w16se w16cid w16 w16cex w16sdtdh w16sdtfl w16du wp14">
   <w:footnote w:type="separator" w:id="-1">
     <w:p>
       <w:pPr>
@@ -56343,7 +56315,7 @@
 </file>
 
 <file path=word/header1.xml><?xml version="1.0" encoding="utf-8"?>
-<w:hdr xmlns:wpc="http://schemas.microsoft.com/office/word/2010/wordprocessingCanvas" xmlns:cx="http://schemas.microsoft.com/office/drawing/2014/chartex" xmlns:cx1="http://schemas.microsoft.com/office/drawing/2015/9/8/chartex" xmlns:cx2="http://schemas.microsoft.com/office/drawing/2015/10/21/chartex" xmlns:cx3="http://schemas.microsoft.com/office/drawing/2016/5/9/chartex" xmlns:cx4="http://schemas.microsoft.com/office/drawing/2016/5/10/chartex" xmlns:cx5="http://schemas.microsoft.com/office/drawing/2016/5/11/chartex" xmlns:cx6="http://schemas.microsoft.com/office/drawing/2016/5/12/chartex" xmlns:cx7="http://schemas.microsoft.com/office/drawing/2016/5/13/chartex" xmlns:cx8="http://schemas.microsoft.com/office/drawing/2016/5/14/chartex" xmlns:mc="http://schemas.openxmlformats.org/markup-compatibility/2006" xmlns:aink="http://schemas.microsoft.com/office/drawing/2016/ink" xmlns:am3d="http://schemas.microsoft.com/office/drawing/2017/model3d" xmlns:o="urn:schemas-microsoft-com:office:office" xmlns:oel="http://schemas.microsoft.com/office/2019/extlst" xmlns:r="http://schemas.openxmlformats.org/officeDocument/2006/relationships" xmlns:m="http://schemas.openxmlformats.org/officeDocument/2006/math" xmlns:v="urn:schemas-microsoft-com:vml" xmlns:wp14="http://schemas.microsoft.com/office/word/2010/wordprocessingDrawing" xmlns:wp="http://schemas.openxmlformats.org/drawingml/2006/wordprocessingDrawing" xmlns:w10="urn:schemas-microsoft-com:office:word" xmlns:w="http://schemas.openxmlformats.org/wordprocessingml/2006/main" xmlns:w14="http://schemas.microsoft.com/office/word/2010/wordml" xmlns:w15="http://schemas.microsoft.com/office/word/2012/wordml" xmlns:w16cex="http://schemas.microsoft.com/office/word/2018/wordml/cex" xmlns:w16cid="http://schemas.microsoft.com/office/word/2016/wordml/cid" xmlns:w16="http://schemas.microsoft.com/office/word/2018/wordml" xmlns:w16du="http://schemas.microsoft.com/office/word/2023/wordml/word16du" xmlns:w16sdtdh="http://schemas.microsoft.com/office/word/2020/wordml/sdtdatahash" xmlns:w16sdtfl="http://schemas.microsoft.com/office/word/2024/wordml/sdtformatlock" xmlns:w16se="http://schemas.microsoft.com/office/word/2015/wordml/symex" xmlns:wpg="http://schemas.microsoft.com/office/word/2010/wordprocessingGroup" xmlns:wpi="http://schemas.microsoft.com/office/word/2010/wordprocessingInk" xmlns:wne="http://schemas.microsoft.com/office/word/2006/wordml" xmlns:wps="http://schemas.microsoft.com/office/word/2010/wordprocessingShape" mc:Ignorable="w14 w15 w16se w16cid w16 w16cex w16sdtdh w16sdtfl w16du wp14">
+<w:hdr xmlns:wpc="http://schemas.microsoft.com/office/word/2010/wordprocessingCanvas" xmlns:cx="http://schemas.microsoft.com/office/drawing/2014/chartex" xmlns:cx1="http://schemas.microsoft.com/office/drawing/2015/9/8/chartex" xmlns:cx2="http://schemas.microsoft.com/office/drawing/2015/10/21/chartex" xmlns:cx3="http://schemas.microsoft.com/office/drawing/2016/5/9/chartex" xmlns:cx4="http://schemas.microsoft.com/office/drawing/2016/5/10/chartex" xmlns:cx5="http://schemas.microsoft.com/office/drawing/2016/5/11/chartex" xmlns:cx6="http://schemas.microsoft.com/office/drawing/2016/5/12/chartex" xmlns:cx7="http://schemas.microsoft.com/office/drawing/2016/5/13/chartex" xmlns:cx8="http://schemas.microsoft.com/office/drawing/2016/5/14/chartex" xmlns:mc="http://schemas.openxmlformats.org/markup-compatibility/2006" xmlns:aink="http://schemas.microsoft.com/office/drawing/2016/ink" xmlns:am3d="http://schemas.microsoft.com/office/drawing/2017/model3d" xmlns:o="urn:schemas-microsoft-com:office:office" xmlns:oel="http://schemas.microsoft.com/office/2019/extlst" xmlns:r="http://schemas.openxmlformats.org/officeDocument/2006/relationships" xmlns:m="http://schemas.openxmlformats.org/officeDocument/2006/math" xmlns:v="urn:schemas-microsoft-com:vml" xmlns:wp14="http://schemas.microsoft.com/office/word/2010/wordprocessingDrawing" xmlns:wp="http://schemas.openxmlformats.org/drawingml/2006/wordprocessingDrawing" xmlns:w10="urn:schemas-microsoft-com:office:word" xmlns:w="http://schemas.openxmlformats.org/wordprocessingml/2006/main" xmlns:w14="http://schemas.microsoft.com/office/word/2010/wordml" xmlns:w15="http://schemas.microsoft.com/office/word/2012/wordml" xmlns:w16cei="http://schemas.microsoft.com/office/word/2026/wordml/cei" xmlns:w16cex="http://schemas.microsoft.com/office/word/2018/wordml/cex" xmlns:w16cid="http://schemas.microsoft.com/office/word/2016/wordml/cid" xmlns:w16="http://schemas.microsoft.com/office/word/2018/wordml" xmlns:w16du="http://schemas.microsoft.com/office/word/2023/wordml/word16du" xmlns:w16sdtdh="http://schemas.microsoft.com/office/word/2020/wordml/sdtdatahash" xmlns:w16sdtfl="http://schemas.microsoft.com/office/word/2024/wordml/sdtformatlock" xmlns:w16se="http://schemas.microsoft.com/office/word/2015/wordml/symex" xmlns:wpg="http://schemas.microsoft.com/office/word/2010/wordprocessingGroup" xmlns:wpi="http://schemas.microsoft.com/office/word/2010/wordprocessingInk" xmlns:wne="http://schemas.microsoft.com/office/word/2006/wordml" xmlns:wps="http://schemas.microsoft.com/office/word/2010/wordprocessingShape" mc:Ignorable="w14 w15 w16se w16cid w16 w16cex w16sdtdh w16sdtfl w16du wp14">
   <w:p>
     <w:pPr>
       <w:pStyle w:val="Header"/>
@@ -56364,7 +56336,7 @@
 </file>
 
 <file path=word/header2.xml><?xml version="1.0" encoding="utf-8"?>
-<w:hdr xmlns:wpc="http://schemas.microsoft.com/office/word/2010/wordprocessingCanvas" xmlns:cx="http://schemas.microsoft.com/office/drawing/2014/chartex" xmlns:cx1="http://schemas.microsoft.com/office/drawing/2015/9/8/chartex" xmlns:cx2="http://schemas.microsoft.com/office/drawing/2015/10/21/chartex" xmlns:cx3="http://schemas.microsoft.com/office/drawing/2016/5/9/chartex" xmlns:cx4="http://schemas.microsoft.com/office/drawing/2016/5/10/chartex" xmlns:cx5="http://schemas.microsoft.com/office/drawing/2016/5/11/chartex" xmlns:cx6="http://schemas.microsoft.com/office/drawing/2016/5/12/chartex" xmlns:cx7="http://schemas.microsoft.com/office/drawing/2016/5/13/chartex" xmlns:cx8="http://schemas.microsoft.com/office/drawing/2016/5/14/chartex" xmlns:mc="http://schemas.openxmlformats.org/markup-compatibility/2006" xmlns:aink="http://schemas.microsoft.com/office/drawing/2016/ink" xmlns:am3d="http://schemas.microsoft.com/office/drawing/2017/model3d" xmlns:o="urn:schemas-microsoft-com:office:office" xmlns:oel="http://schemas.microsoft.com/office/2019/extlst" xmlns:r="http://schemas.openxmlformats.org/officeDocument/2006/relationships" xmlns:m="http://schemas.openxmlformats.org/officeDocument/2006/math" xmlns:v="urn:schemas-microsoft-com:vml" xmlns:wp14="http://schemas.microsoft.com/office/word/2010/wordprocessingDrawing" xmlns:wp="http://schemas.openxmlformats.org/drawingml/2006/wordprocessingDrawing" xmlns:w10="urn:schemas-microsoft-com:office:word" xmlns:w="http://schemas.openxmlformats.org/wordprocessingml/2006/main" xmlns:w14="http://schemas.microsoft.com/office/word/2010/wordml" xmlns:w15="http://schemas.microsoft.com/office/word/2012/wordml" xmlns:w16cex="http://schemas.microsoft.com/office/word/2018/wordml/cex" xmlns:w16cid="http://schemas.microsoft.com/office/word/2016/wordml/cid" xmlns:w16="http://schemas.microsoft.com/office/word/2018/wordml" xmlns:w16du="http://schemas.microsoft.com/office/word/2023/wordml/word16du" xmlns:w16sdtdh="http://schemas.microsoft.com/office/word/2020/wordml/sdtdatahash" xmlns:w16sdtfl="http://schemas.microsoft.com/office/word/2024/wordml/sdtformatlock" xmlns:w16se="http://schemas.microsoft.com/office/word/2015/wordml/symex" xmlns:wpg="http://schemas.microsoft.com/office/word/2010/wordprocessingGroup" xmlns:wpi="http://schemas.microsoft.com/office/word/2010/wordprocessingInk" xmlns:wne="http://schemas.microsoft.com/office/word/2006/wordml" xmlns:wps="http://schemas.microsoft.com/office/word/2010/wordprocessingShape" mc:Ignorable="w14 w15 w16se w16cid w16 w16cex w16sdtdh w16sdtfl w16du wp14">
+<w:hdr xmlns:wpc="http://schemas.microsoft.com/office/word/2010/wordprocessingCanvas" xmlns:cx="http://schemas.microsoft.com/office/drawing/2014/chartex" xmlns:cx1="http://schemas.microsoft.com/office/drawing/2015/9/8/chartex" xmlns:cx2="http://schemas.microsoft.com/office/drawing/2015/10/21/chartex" xmlns:cx3="http://schemas.microsoft.com/office/drawing/2016/5/9/chartex" xmlns:cx4="http://schemas.microsoft.com/office/drawing/2016/5/10/chartex" xmlns:cx5="http://schemas.microsoft.com/office/drawing/2016/5/11/chartex" xmlns:cx6="http://schemas.microsoft.com/office/drawing/2016/5/12/chartex" xmlns:cx7="http://schemas.microsoft.com/office/drawing/2016/5/13/chartex" xmlns:cx8="http://schemas.microsoft.com/office/drawing/2016/5/14/chartex" xmlns:mc="http://schemas.openxmlformats.org/markup-compatibility/2006" xmlns:aink="http://schemas.microsoft.com/office/drawing/2016/ink" xmlns:am3d="http://schemas.microsoft.com/office/drawing/2017/model3d" xmlns:o="urn:schemas-microsoft-com:office:office" xmlns:oel="http://schemas.microsoft.com/office/2019/extlst" xmlns:r="http://schemas.openxmlformats.org/officeDocument/2006/relationships" xmlns:m="http://schemas.openxmlformats.org/officeDocument/2006/math" xmlns:v="urn:schemas-microsoft-com:vml" xmlns:wp14="http://schemas.microsoft.com/office/word/2010/wordprocessingDrawing" xmlns:wp="http://schemas.openxmlformats.org/drawingml/2006/wordprocessingDrawing" xmlns:w10="urn:schemas-microsoft-com:office:word" xmlns:w="http://schemas.openxmlformats.org/wordprocessingml/2006/main" xmlns:w14="http://schemas.microsoft.com/office/word/2010/wordml" xmlns:w15="http://schemas.microsoft.com/office/word/2012/wordml" xmlns:w16cei="http://schemas.microsoft.com/office/word/2026/wordml/cei" xmlns:w16cex="http://schemas.microsoft.com/office/word/2018/wordml/cex" xmlns:w16cid="http://schemas.microsoft.com/office/word/2016/wordml/cid" xmlns:w16="http://schemas.microsoft.com/office/word/2018/wordml" xmlns:w16du="http://schemas.microsoft.com/office/word/2023/wordml/word16du" xmlns:w16sdtdh="http://schemas.microsoft.com/office/word/2020/wordml/sdtdatahash" xmlns:w16sdtfl="http://schemas.microsoft.com/office/word/2024/wordml/sdtformatlock" xmlns:w16se="http://schemas.microsoft.com/office/word/2015/wordml/symex" xmlns:wpg="http://schemas.microsoft.com/office/word/2010/wordprocessingGroup" xmlns:wpi="http://schemas.microsoft.com/office/word/2010/wordprocessingInk" xmlns:wne="http://schemas.microsoft.com/office/word/2006/wordml" xmlns:wps="http://schemas.microsoft.com/office/word/2010/wordprocessingShape" mc:Ignorable="w14 w15 w16se w16cid w16 w16cex w16sdtdh w16sdtfl w16du wp14">
   <w:p>
     <w:pPr>
       <w:pStyle w:val="Header"/>

</xml_diff>